<commit_message>
Update manuscript method figures
</commit_message>
<xml_diff>
--- a/public_release/manuscript/manuscript.docx
+++ b/public_release/manuscript/manuscript.docx
@@ -610,7 +610,7 @@
       <w:r>
         <w:drawing>
           <wp:inline>
-            <wp:extent cx="5334000" cy="1942425"/>
+            <wp:extent cx="5334000" cy="2208400"/>
             <wp:effectExtent b="0" l="0" r="0" t="0"/>
             <wp:docPr descr="Pipeline overview" title="" id="25" name="Picture"/>
             <a:graphic>
@@ -631,7 +631,7 @@
                   <pic:spPr bwMode="auto">
                     <a:xfrm>
                       <a:off x="0" y="0"/>
-                      <a:ext cx="5334000" cy="1942425"/>
+                      <a:ext cx="5334000" cy="2208400"/>
                     </a:xfrm>
                     <a:prstGeom prst="rect">
                       <a:avLst/>
@@ -733,7 +733,7 @@
       <w:r>
         <w:drawing>
           <wp:inline>
-            <wp:extent cx="5334000" cy="2543764"/>
+            <wp:extent cx="5334000" cy="2435474"/>
             <wp:effectExtent b="0" l="0" r="0" t="0"/>
             <wp:docPr descr="Active-learning loop" title="" id="29" name="Picture"/>
             <a:graphic>
@@ -754,7 +754,7 @@
                   <pic:spPr bwMode="auto">
                     <a:xfrm>
                       <a:off x="0" y="0"/>
-                      <a:ext cx="5334000" cy="2543764"/>
+                      <a:ext cx="5334000" cy="2435474"/>
                     </a:xfrm>
                     <a:prstGeom prst="rect">
                       <a:avLst/>

</xml_diff>

<commit_message>
Clarify AF2 budget reduction table
</commit_message>
<xml_diff>
--- a/public_release/manuscript/manuscript.docx
+++ b/public_release/manuscript/manuscript.docx
@@ -6370,15 +6370,15 @@
     <w:tbl>
       <w:tblPr>
         <w:tblStyle w:val="Table"/>
-        <w:tblW w:type="pct" w:w="5000"/>
+        <w:tblW w:type="auto" w:w="0"/>
         <w:tblLook w:firstRow="1" w:lastRow="0" w:firstColumn="0" w:lastColumn="0" w:noHBand="0" w:noVBand="0" w:val="0020"/>
         <w:jc w:val="start"/>
       </w:tblPr>
       <w:tblGrid>
-        <w:gridCol w:w="1584"/>
-        <w:gridCol w:w="2112"/>
-        <w:gridCol w:w="2112"/>
-        <w:gridCol w:w="2112"/>
+        <w:gridCol w:w="1980"/>
+        <w:gridCol w:w="1980"/>
+        <w:gridCol w:w="1980"/>
+        <w:gridCol w:w="1980"/>
       </w:tblGrid>
       <w:tr>
         <w:trPr>
@@ -6392,7 +6392,7 @@
               <w:jc w:val="left"/>
             </w:pPr>
             <w:r>
-              <w:t xml:space="preserve">Per-round AF2 budget model</w:t>
+              <w:t xml:space="preserve">Budget model</w:t>
             </w:r>
           </w:p>
         </w:tc>
@@ -6416,19 +6416,19 @@
               <w:jc w:val="right"/>
             </w:pPr>
             <w:r>
-              <w:t xml:space="preserve">Round 1 (with surrogate)</w:t>
-            </w:r>
-          </w:p>
-        </w:tc>
-        <w:tc>
-          <w:tcPr/>
-          <w:p>
-            <w:pPr>
-              <w:pStyle w:val="Compact"/>
-              <w:jc w:val="right"/>
-            </w:pPr>
-            <w:r>
-              <w:t xml:space="preserve">Rounds 2-4 (label reuse / archived surrogate)</w:t>
+              <w:t xml:space="preserve">With active learning</w:t>
+            </w:r>
+          </w:p>
+        </w:tc>
+        <w:tc>
+          <w:tcPr/>
+          <w:p>
+            <w:pPr>
+              <w:pStyle w:val="Compact"/>
+              <w:jc w:val="right"/>
+            </w:pPr>
+            <w:r>
+              <w:t xml:space="preserve">Reduction</w:t>
             </w:r>
           </w:p>
         </w:tc>
@@ -6442,7 +6442,7 @@
               <w:jc w:val="left"/>
             </w:pPr>
             <w:r>
-              <w:t xml:space="preserve">AF2 evaluations</w:t>
+              <w:t xml:space="preserve">Round 1</w:t>
             </w:r>
           </w:p>
         </w:tc>
@@ -6466,19 +6466,19 @@
               <w:jc w:val="right"/>
             </w:pPr>
             <w:r>
-              <w:t xml:space="preserve">30 + 20 = 50</w:t>
-            </w:r>
-          </w:p>
-        </w:tc>
-        <w:tc>
-          <w:tcPr/>
-          <w:p>
-            <w:pPr>
-              <w:pStyle w:val="Compact"/>
-              <w:jc w:val="right"/>
-            </w:pPr>
-            <w:r>
-              <w:t xml:space="preserve">20</w:t>
+              <w:t xml:space="preserve">50</w:t>
+            </w:r>
+          </w:p>
+        </w:tc>
+        <w:tc>
+          <w:tcPr/>
+          <w:p>
+            <w:pPr>
+              <w:pStyle w:val="Compact"/>
+              <w:jc w:val="right"/>
+            </w:pPr>
+            <w:r>
+              <w:t xml:space="preserve">44%</w:t>
             </w:r>
           </w:p>
         </w:tc>
@@ -6492,51 +6492,93 @@
               <w:jc w:val="left"/>
             </w:pPr>
             <w:r>
-              <w:t xml:space="preserve">Reduction vs no-surrogate</w:t>
-            </w:r>
-          </w:p>
-        </w:tc>
-        <w:tc>
-          <w:tcPr/>
-          <w:p>
-            <w:pPr>
-              <w:pStyle w:val="Compact"/>
-              <w:jc w:val="right"/>
-            </w:pPr>
-            <w:r>
-              <w:t xml:space="preserve">-</w:t>
-            </w:r>
-          </w:p>
-        </w:tc>
-        <w:tc>
-          <w:tcPr/>
-          <w:p>
-            <w:pPr>
-              <w:pStyle w:val="Compact"/>
-              <w:jc w:val="right"/>
-            </w:pPr>
-            <w:r>
-              <w:rPr>
-                <w:bCs/>
-                <w:b/>
-              </w:rPr>
-              <w:t xml:space="preserve">44%</w:t>
-            </w:r>
-          </w:p>
-        </w:tc>
-        <w:tc>
-          <w:tcPr/>
-          <w:p>
-            <w:pPr>
-              <w:pStyle w:val="Compact"/>
-              <w:jc w:val="right"/>
-            </w:pPr>
-            <w:r>
-              <w:rPr>
-                <w:bCs/>
-                <w:b/>
-              </w:rPr>
+              <w:t xml:space="preserve">Rounds 2-4 total</w:t>
+            </w:r>
+          </w:p>
+        </w:tc>
+        <w:tc>
+          <w:tcPr/>
+          <w:p>
+            <w:pPr>
+              <w:pStyle w:val="Compact"/>
+              <w:jc w:val="right"/>
+            </w:pPr>
+            <w:r>
+              <w:t xml:space="preserve">270</w:t>
+            </w:r>
+          </w:p>
+        </w:tc>
+        <w:tc>
+          <w:tcPr/>
+          <w:p>
+            <w:pPr>
+              <w:pStyle w:val="Compact"/>
+              <w:jc w:val="right"/>
+            </w:pPr>
+            <w:r>
+              <w:t xml:space="preserve">60</w:t>
+            </w:r>
+          </w:p>
+        </w:tc>
+        <w:tc>
+          <w:tcPr/>
+          <w:p>
+            <w:pPr>
+              <w:pStyle w:val="Compact"/>
+              <w:jc w:val="right"/>
+            </w:pPr>
+            <w:r>
               <w:t xml:space="preserve">78%</w:t>
+            </w:r>
+          </w:p>
+        </w:tc>
+      </w:tr>
+      <w:tr>
+        <w:tc>
+          <w:tcPr/>
+          <w:p>
+            <w:pPr>
+              <w:pStyle w:val="Compact"/>
+              <w:jc w:val="left"/>
+            </w:pPr>
+            <w:r>
+              <w:t xml:space="preserve">Four-round total</w:t>
+            </w:r>
+          </w:p>
+        </w:tc>
+        <w:tc>
+          <w:tcPr/>
+          <w:p>
+            <w:pPr>
+              <w:pStyle w:val="Compact"/>
+              <w:jc w:val="right"/>
+            </w:pPr>
+            <w:r>
+              <w:t xml:space="preserve">360</w:t>
+            </w:r>
+          </w:p>
+        </w:tc>
+        <w:tc>
+          <w:tcPr/>
+          <w:p>
+            <w:pPr>
+              <w:pStyle w:val="Compact"/>
+              <w:jc w:val="right"/>
+            </w:pPr>
+            <w:r>
+              <w:t xml:space="preserve">110</w:t>
+            </w:r>
+          </w:p>
+        </w:tc>
+        <w:tc>
+          <w:tcPr/>
+          <w:p>
+            <w:pPr>
+              <w:pStyle w:val="Compact"/>
+              <w:jc w:val="right"/>
+            </w:pPr>
+            <w:r>
+              <w:t xml:space="preserve">69%</w:t>
             </w:r>
           </w:p>
         </w:tc>
@@ -6551,7 +6593,7 @@
           <w:iCs/>
           <w:i/>
         </w:rPr>
-        <w:t xml:space="preserve">Table 12. AF2 budget per round on a 90-candidate SoluProt-gated pool. Round 1 evaluates 30 K-means training candidates and 20 surrogate-selected candidates (50 total); rounds 2-4 reuse the trained surrogate and only evaluate the 20 top-ranked candidates each. Across a four-round campaign the total AF2 budget is 50 + 20 x 3 = 110 evaluations versus 90 x 4 = 360 without the surrogate, a 69% overall reduction.</w:t>
+        <w:t xml:space="preserve">Table 12. AF2 budget model for a 90-candidate SoluProt-gated pool. Round 1 evaluates 30 K-means training candidates and 20 surrogate-selected candidates (50 total); rounds 2-4 reuse the archived surrogate and evaluate only the 20 top-ranked candidates per round. Across a four-round campaign, active learning reduces the AF2 budget from 360 to 110 evaluations, a 69% reduction and approximately 3.3x fewer AF2 calls/GPU time at fixed per-call runtime.</w:t>
       </w:r>
     </w:p>
     <w:p>

</xml_diff>

<commit_message>
Clarify orchestration and evidence agent trace
</commit_message>
<xml_diff>
--- a/public_release/manuscript/manuscript.docx
+++ b/public_release/manuscript/manuscript.docx
@@ -2,7 +2,7 @@
 <file path=word/document.xml><?xml version="1.0" encoding="utf-8"?>
 <w:document xmlns:w="http://schemas.openxmlformats.org/wordprocessingml/2006/main" xmlns:m="http://schemas.openxmlformats.org/officeDocument/2006/math" xmlns:r="http://schemas.openxmlformats.org/officeDocument/2006/relationships" xmlns:o="urn:schemas-microsoft-com:office:office" xmlns:v="urn:schemas-microsoft-com:vml" xmlns:w10="urn:schemas-microsoft-com:office:word" xmlns:a="http://schemas.openxmlformats.org/drawingml/2006/main" xmlns:pic="http://schemas.openxmlformats.org/drawingml/2006/picture" xmlns:wp="http://schemas.openxmlformats.org/drawingml/2006/wordprocessingDrawing">
   <w:body>
-    <w:bookmarkStart w:id="81" w:name="X423611d9cf12f3a36a99a3149b0ec29bbb547c9"/>
+    <w:bookmarkStart w:id="82" w:name="X423611d9cf12f3a36a99a3149b0ec29bbb547c9"/>
     <w:p>
       <w:pPr>
         <w:pStyle w:val="Heading1"/>
@@ -55,7 +55,7 @@
         <w:t xml:space="preserve">protein_pipeline</w:t>
       </w:r>
       <w:r>
-        <w:t xml:space="preserve">, a stage-aware and artifact-preserving orchestration framework for reproducible solubility-aware protein library design. The system exposes each modelling stage through typed inputs and run-scoped artifacts, enabling safe partial reruns and model replacement without changing downstream analysis.</w:t>
+        <w:t xml:space="preserve">, a stage-aware and artifact-preserving orchestration framework for reproducible solubility-aware protein library design. The system exposes each modelling stage through typed inputs and run-scoped artifacts, enabling safe partial reruns and model replacement without changing downstream analysis. To make this orchestration inspectable, each run records a machine-readable orchestration trace that separates deterministic control-plane events from advisory evidence-agent verdicts.</w:t>
       </w:r>
     </w:p>
     <w:p>
@@ -160,7 +160,7 @@
       </w:r>
     </w:p>
     <w:bookmarkEnd w:id="21"/>
-    <w:bookmarkStart w:id="37" w:name="methods"/>
+    <w:bookmarkStart w:id="38" w:name="methods"/>
     <w:p>
       <w:pPr>
         <w:pStyle w:val="Heading2"/>
@@ -320,6 +320,28 @@
     </w:p>
     <w:p>
       <w:pPr>
+        <w:numPr>
+          <w:ilvl w:val="0"/>
+          <w:numId w:val="1001"/>
+        </w:numPr>
+        <w:pStyle w:val="Compact"/>
+      </w:pPr>
+      <w:r>
+        <w:rPr>
+          <w:bCs/>
+          <w:b/>
+        </w:rPr>
+        <w:t xml:space="preserve">Inspectable orchestration and evidence review.</w:t>
+      </w:r>
+      <w:r>
+        <w:t xml:space="preserve"> </w:t>
+      </w:r>
+      <w:r>
+        <w:t xml:space="preserve">The platform should record which stage ran, which gate or checkpoint was reached, and which advisory agent verdict was produced, without conflating deterministic execution with autonomous scientific decision-making.</w:t>
+      </w:r>
+    </w:p>
+    <w:p>
+      <w:pPr>
         <w:pStyle w:val="FirstParagraph"/>
       </w:pPr>
       <w:r>
@@ -527,7 +549,7 @@
         <w:pStyle w:val="BodyText"/>
       </w:pPr>
       <w:r>
-        <w:t xml:space="preserve">Each run writes request metadata, intermediate outputs, status records, and final summaries under a run-scoped artifact directory. The run identifier is the unit of provenance. This structure supports controlled partial reruns: downstream filtering or evaluation can be repeated when only downstream parameters change, while unsafe reuse is blocked when upstream inputs differ. The same artifact contract is used by the benchmark scripts, so the empirical analyses can be rerun from stored outputs rather than from live model calls.</w:t>
+        <w:t xml:space="preserve">Each run writes request metadata, intermediate outputs, status records, orchestration trace events, and final summaries under a run-scoped artifact directory. The run identifier is the unit of provenance. This structure supports controlled partial reruns: downstream filtering or evaluation can be repeated when only downstream parameters change, while unsafe reuse is blocked when upstream inputs differ. The same artifact contract is used by the benchmark scripts, so the empirical analyses can be rerun from stored outputs rather than from live model calls.</w:t>
       </w:r>
     </w:p>
     <w:bookmarkEnd w:id="23"/>
@@ -693,13 +715,230 @@
       </w:r>
     </w:p>
     <w:bookmarkEnd w:id="27"/>
-    <w:bookmarkStart w:id="31" w:name="active-learning-module-for-af2-reduction"/>
+    <w:bookmarkStart w:id="28" w:name="orchestration-trace-and-evidence-agents"/>
     <w:p>
       <w:pPr>
         <w:pStyle w:val="Heading3"/>
       </w:pPr>
       <w:r>
-        <w:t xml:space="preserve">2.4 Active-Learning Module for AF2 Reduction</w:t>
+        <w:t xml:space="preserve">2.4 Orchestration Trace and Evidence Agents</w:t>
+      </w:r>
+    </w:p>
+    <w:p>
+      <w:pPr>
+        <w:pStyle w:val="FirstParagraph"/>
+      </w:pPr>
+      <w:r>
+        <w:t xml:space="preserve">The implementation separates three operational planes. The</w:t>
+      </w:r>
+      <w:r>
+        <w:t xml:space="preserve"> </w:t>
+      </w:r>
+      <w:r>
+        <w:rPr>
+          <w:bCs/>
+          <w:b/>
+        </w:rPr>
+        <w:t xml:space="preserve">control plane</w:t>
+      </w:r>
+      <w:r>
+        <w:t xml:space="preserve"> </w:t>
+      </w:r>
+      <w:r>
+        <w:t xml:space="preserve">is deterministic: the pipeline runner validates requests, resolves the stage order, emits status transitions, enforces safe rerun rules, and records checkpoint or stop/resume state. The</w:t>
+      </w:r>
+      <w:r>
+        <w:t xml:space="preserve"> </w:t>
+      </w:r>
+      <w:r>
+        <w:rPr>
+          <w:bCs/>
+          <w:b/>
+        </w:rPr>
+        <w:t xml:space="preserve">model-execution plane</w:t>
+      </w:r>
+      <w:r>
+        <w:t xml:space="preserve"> </w:t>
+      </w:r>
+      <w:r>
+        <w:t xml:space="preserve">is provider-agnostic: a model stage can be backed by a local GPU HTTP service, RunPod endpoint, or disabled provider as long as it writes the expected artifact contract. The</w:t>
+      </w:r>
+      <w:r>
+        <w:t xml:space="preserve"> </w:t>
+      </w:r>
+      <w:r>
+        <w:rPr>
+          <w:bCs/>
+          <w:b/>
+        </w:rPr>
+        <w:t xml:space="preserve">evidence plane</w:t>
+      </w:r>
+      <w:r>
+        <w:t xml:space="preserve"> </w:t>
+      </w:r>
+      <w:r>
+        <w:t xml:space="preserve">is advisory: stage-specific agents read stored artifacts and emit structured verdicts such as</w:t>
+      </w:r>
+      <w:r>
+        <w:t xml:space="preserve"> </w:t>
+      </w:r>
+      <w:r>
+        <w:rPr>
+          <w:rStyle w:val="VerbatimChar"/>
+        </w:rPr>
+        <w:t xml:space="preserve">proceed</w:t>
+      </w:r>
+      <w:r>
+        <w:t xml:space="preserve">,</w:t>
+      </w:r>
+      <w:r>
+        <w:t xml:space="preserve"> </w:t>
+      </w:r>
+      <w:r>
+        <w:rPr>
+          <w:rStyle w:val="VerbatimChar"/>
+        </w:rPr>
+        <w:t xml:space="preserve">monitor</w:t>
+      </w:r>
+      <w:r>
+        <w:t xml:space="preserve">, or</w:t>
+      </w:r>
+      <w:r>
+        <w:t xml:space="preserve"> </w:t>
+      </w:r>
+      <w:r>
+        <w:rPr>
+          <w:rStyle w:val="VerbatimChar"/>
+        </w:rPr>
+        <w:t xml:space="preserve">recover</w:t>
+      </w:r>
+      <w:r>
+        <w:t xml:space="preserve">, together with confidence, rationale, error context, and recommended recovery actions. The evidence plane does not silently mutate design constraints or replace the deterministic stage graph in the benchmarked analyses.</w:t>
+      </w:r>
+    </w:p>
+    <w:p>
+      <w:pPr>
+        <w:pStyle w:val="BodyText"/>
+      </w:pPr>
+      <w:r>
+        <w:t xml:space="preserve">These planes are joined by an append-only</w:t>
+      </w:r>
+      <w:r>
+        <w:t xml:space="preserve"> </w:t>
+      </w:r>
+      <w:r>
+        <w:rPr>
+          <w:rStyle w:val="VerbatimChar"/>
+        </w:rPr>
+        <w:t xml:space="preserve">orchestration_trace.jsonl</w:t>
+      </w:r>
+      <w:r>
+        <w:t xml:space="preserve"> </w:t>
+      </w:r>
+      <w:r>
+        <w:t xml:space="preserve">file in each</w:t>
+      </w:r>
+      <w:r>
+        <w:t xml:space="preserve"> </w:t>
+      </w:r>
+      <w:r>
+        <w:rPr>
+          <w:rStyle w:val="VerbatimChar"/>
+        </w:rPr>
+        <w:t xml:space="preserve">run_id</w:t>
+      </w:r>
+      <w:r>
+        <w:t xml:space="preserve"> </w:t>
+      </w:r>
+      <w:r>
+        <w:t xml:space="preserve">directory. Control-plane records capture stage status events such as</w:t>
+      </w:r>
+      <w:r>
+        <w:t xml:space="preserve"> </w:t>
+      </w:r>
+      <w:r>
+        <w:rPr>
+          <w:rStyle w:val="VerbatimChar"/>
+        </w:rPr>
+        <w:t xml:space="preserve">stage=mmseqs_msa</w:t>
+      </w:r>
+      <w:r>
+        <w:t xml:space="preserve">,</w:t>
+      </w:r>
+      <w:r>
+        <w:t xml:space="preserve"> </w:t>
+      </w:r>
+      <w:r>
+        <w:rPr>
+          <w:rStyle w:val="VerbatimChar"/>
+        </w:rPr>
+        <w:t xml:space="preserve">state=running</w:t>
+      </w:r>
+      <w:r>
+        <w:t xml:space="preserve">, or</w:t>
+      </w:r>
+      <w:r>
+        <w:t xml:space="preserve"> </w:t>
+      </w:r>
+      <w:r>
+        <w:rPr>
+          <w:rStyle w:val="VerbatimChar"/>
+        </w:rPr>
+        <w:t xml:space="preserve">stage=done</w:t>
+      </w:r>
+      <w:r>
+        <w:t xml:space="preserve">,</w:t>
+      </w:r>
+      <w:r>
+        <w:t xml:space="preserve"> </w:t>
+      </w:r>
+      <w:r>
+        <w:rPr>
+          <w:rStyle w:val="VerbatimChar"/>
+        </w:rPr>
+        <w:t xml:space="preserve">state=completed</w:t>
+      </w:r>
+      <w:r>
+        <w:t xml:space="preserve">. Evidence-agent records capture the Agent Panel consensus for the same run, including the stage, verdict, confidence, error message when present, and recovery payload. This trace provides a compact audit trail that is distinct from raw artifacts (</w:t>
+      </w:r>
+      <w:r>
+        <w:rPr>
+          <w:rStyle w:val="VerbatimChar"/>
+        </w:rPr>
+        <w:t xml:space="preserve">designs.fasta</w:t>
+      </w:r>
+      <w:r>
+        <w:t xml:space="preserve">,</w:t>
+      </w:r>
+      <w:r>
+        <w:t xml:space="preserve"> </w:t>
+      </w:r>
+      <w:r>
+        <w:rPr>
+          <w:rStyle w:val="VerbatimChar"/>
+        </w:rPr>
+        <w:t xml:space="preserve">af2_scores.json</w:t>
+      </w:r>
+      <w:r>
+        <w:t xml:space="preserve">, structure files) and from user-facing reports. It is particularly useful for failure analysis: for example, a BioEmu target-RMSD gate can be represented as a failed or warning verdict with chain-mapping context rather than as an opaque terminal failure.</w:t>
+      </w:r>
+    </w:p>
+    <w:p>
+      <w:pPr>
+        <w:pStyle w:val="BodyText"/>
+      </w:pPr>
+      <w:r>
+        <w:t xml:space="preserve">This design intentionally avoids claiming fully autonomous protein-design decision-making. In the current system, agents are structured expert-review components that summarize evidence and suggest recovery actions. Final progression, rerun, and interpretation remain tied to explicit pipeline state, checkpoint controls, stored artifacts, and, when used through Workflow Studio, human review.</w:t>
+      </w:r>
+    </w:p>
+    <w:bookmarkEnd w:id="28"/>
+    <w:bookmarkStart w:id="32" w:name="active-learning-module-for-af2-reduction"/>
+    <w:p>
+      <w:pPr>
+        <w:pStyle w:val="Heading3"/>
+      </w:pPr>
+      <w:r>
+        <w:t xml:space="preserve">2.5 Active-Learning Module for AF2 Reduction</w:t>
       </w:r>
     </w:p>
     <w:p>
@@ -735,18 +974,18 @@
           <wp:inline>
             <wp:extent cx="5334000" cy="2435474"/>
             <wp:effectExtent b="0" l="0" r="0" t="0"/>
-            <wp:docPr descr="Active-learning loop" title="" id="29" name="Picture"/>
+            <wp:docPr descr="Active-learning loop" title="" id="30" name="Picture"/>
             <a:graphic>
               <a:graphicData uri="http://schemas.openxmlformats.org/drawingml/2006/picture">
                 <pic:pic>
                   <pic:nvPicPr>
-                    <pic:cNvPr descr="figures/benchmark/fig2_active_learning_loop.png" id="30" name="Picture"/>
+                    <pic:cNvPr descr="figures/benchmark/fig2_active_learning_loop.png" id="31" name="Picture"/>
                     <pic:cNvPicPr>
                       <a:picLocks noChangeArrowheads="1" noChangeAspect="1"/>
                     </pic:cNvPicPr>
                   </pic:nvPicPr>
                   <pic:blipFill>
-                    <a:blip r:embed="rId28"/>
+                    <a:blip r:embed="rId29"/>
                     <a:stretch>
                       <a:fillRect/>
                     </a:stretch>
@@ -793,14 +1032,14 @@
         <w:t xml:space="preserve">Figure 2. Active-learning loop used to reduce AF2 calls. A small K-means-selected training set is labelled by AF2, a local surrogate ranks the remaining pool, and AF2 is reserved for the surrogate’s top-ranked candidates. In multi-round mode, the archived surrogate is reused on later candidate pools so that only Top-K candidates are folded after the bootstrap round.</w:t>
       </w:r>
     </w:p>
-    <w:bookmarkEnd w:id="31"/>
-    <w:bookmarkStart w:id="35" w:name="X86ae9e3ed42b8aebbf96b87c3b13c0ee5b223bd"/>
+    <w:bookmarkEnd w:id="32"/>
+    <w:bookmarkStart w:id="36" w:name="X86ae9e3ed42b8aebbf96b87c3b13c0ee5b223bd"/>
     <w:p>
       <w:pPr>
         <w:pStyle w:val="Heading3"/>
       </w:pPr>
       <w:r>
-        <w:t xml:space="preserve">2.5 Benchmark Dataset, Surrogates, and QC Filtering</w:t>
+        <w:t xml:space="preserve">2.6 Benchmark Dataset, Surrogates, and QC Filtering</w:t>
       </w:r>
     </w:p>
     <w:p>
@@ -1171,18 +1410,18 @@
           <wp:inline>
             <wp:extent cx="5334000" cy="4185209"/>
             <wp:effectExtent b="0" l="0" r="0" t="0"/>
-            <wp:docPr descr="QC-filtered CATH benchmark corpus" title="" id="33" name="Picture"/>
+            <wp:docPr descr="QC-filtered CATH benchmark corpus" title="" id="34" name="Picture"/>
             <a:graphic>
               <a:graphicData uri="http://schemas.openxmlformats.org/drawingml/2006/picture">
                 <pic:pic>
                   <pic:nvPicPr>
-                    <pic:cNvPr descr="figures/benchmark/fig11_cath_curated_expansion.png" id="34" name="Picture"/>
+                    <pic:cNvPr descr="figures/benchmark/fig11_cath_curated_expansion.png" id="35" name="Picture"/>
                     <pic:cNvPicPr>
                       <a:picLocks noChangeArrowheads="1" noChangeAspect="1"/>
                     </pic:cNvPicPr>
                   </pic:nvPicPr>
                   <pic:blipFill>
-                    <a:blip r:embed="rId32"/>
+                    <a:blip r:embed="rId33"/>
                     <a:stretch>
                       <a:fillRect/>
                     </a:stretch>
@@ -1245,14 +1484,14 @@
         <w:t xml:space="preserve">For each target and seed, a training pool of N candidates is selected either uniformly at random or by K-means cluster centres. The surrogate is trained on that pool and ranks a held-out candidate set. The main model comparison uses N = 30, and the sample-size ablation evaluates N in {5, 10, 20, 30, 50, 80}. The production loop uses N = 30 to match the benchmark default: the N-ablation in Section 3.5 places 20-30 examples on the cost-efficient plateau, so 30 is the largest near-plateau value validated by the main model comparison.</w:t>
       </w:r>
     </w:p>
-    <w:bookmarkEnd w:id="35"/>
-    <w:bookmarkStart w:id="36" w:name="metrics-and-statistical-analysis"/>
+    <w:bookmarkEnd w:id="36"/>
+    <w:bookmarkStart w:id="37" w:name="metrics-and-statistical-analysis"/>
     <w:p>
       <w:pPr>
         <w:pStyle w:val="Heading3"/>
       </w:pPr>
       <w:r>
-        <w:t xml:space="preserve">2.6 Metrics and Statistical Analysis</w:t>
+        <w:t xml:space="preserve">2.7 Metrics and Statistical Analysis</w:t>
       </w:r>
     </w:p>
     <w:p>
@@ -1316,9 +1555,9 @@
         <w:t xml:space="preserve">Paired comparisons use the Wilcoxon signed-rank test [22] with Holm-Bonferroni correction [23]. Effect sizes are reported as Cliff’s delta [24]. Confidence intervals are 95% cluster bootstrap intervals with target as the cluster. Variance decomposition uses the one-way ANOVA-based intraclass correlation coefficient ICC1 [25].</w:t>
       </w:r>
     </w:p>
-    <w:bookmarkEnd w:id="36"/>
     <w:bookmarkEnd w:id="37"/>
-    <w:bookmarkStart w:id="71" w:name="results"/>
+    <w:bookmarkEnd w:id="38"/>
+    <w:bookmarkStart w:id="72" w:name="results"/>
     <w:p>
       <w:pPr>
         <w:pStyle w:val="Heading2"/>
@@ -1327,7 +1566,7 @@
         <w:t xml:space="preserve">3. Results</w:t>
       </w:r>
     </w:p>
-    <w:bookmarkStart w:id="38" w:name="pipeline-execution-and-artifact-reuse"/>
+    <w:bookmarkStart w:id="39" w:name="pipeline-execution-and-artifact-reuse"/>
     <w:p>
       <w:pPr>
         <w:pStyle w:val="Heading3"/>
@@ -1372,8 +1611,8 @@
         <w:t xml:space="preserve">The stage order also makes the compute policy explicit. Backbone diversification and joint multiple-position sequence generation occur before AF2, while SoluProt acts as a cheap soluble-expression gate. The active-learning module then reduces the number of SoluProt-passing candidates sent to AF2. The remaining results quantify the operating point of this policy.</w:t>
       </w:r>
     </w:p>
-    <w:bookmarkEnd w:id="38"/>
-    <w:bookmarkStart w:id="45" w:name="Xf332cea9f599f9be951e16eb82d3fac5ae0b7bb"/>
+    <w:bookmarkEnd w:id="39"/>
+    <w:bookmarkStart w:id="46" w:name="Xf332cea9f599f9be951e16eb82d3fac5ae0b7bb"/>
     <w:p>
       <w:pPr>
         <w:pStyle w:val="Heading3"/>
@@ -1399,18 +1638,18 @@
           <wp:inline>
             <wp:extent cx="5334000" cy="2073653"/>
             <wp:effectExtent b="0" l="0" r="0" t="0"/>
-            <wp:docPr descr="Selection x N" title="" id="40" name="Picture"/>
+            <wp:docPr descr="Selection x N" title="" id="41" name="Picture"/>
             <a:graphic>
               <a:graphicData uri="http://schemas.openxmlformats.org/drawingml/2006/picture">
                 <pic:pic>
                   <pic:nvPicPr>
-                    <pic:cNvPr descr="figures/benchmark/fig3_selection_n_curves.png" id="41" name="Picture"/>
+                    <pic:cNvPr descr="figures/benchmark/fig3_selection_n_curves.png" id="42" name="Picture"/>
                     <pic:cNvPicPr>
                       <a:picLocks noChangeArrowheads="1" noChangeAspect="1"/>
                     </pic:cNvPicPr>
                   </pic:nvPicPr>
                   <pic:blipFill>
-                    <a:blip r:embed="rId39"/>
+                    <a:blip r:embed="rId40"/>
                     <a:stretch>
                       <a:fillRect/>
                     </a:stretch>
@@ -1873,18 +2112,18 @@
           <wp:inline>
             <wp:extent cx="5334000" cy="2075692"/>
             <wp:effectExtent b="0" l="0" r="0" t="0"/>
-            <wp:docPr descr="Selection x model" title="" id="43" name="Picture"/>
+            <wp:docPr descr="Selection x model" title="" id="44" name="Picture"/>
             <a:graphic>
               <a:graphicData uri="http://schemas.openxmlformats.org/drawingml/2006/picture">
                 <pic:pic>
                   <pic:nvPicPr>
-                    <pic:cNvPr descr="figures/benchmark/fig4_selection_comparison.png" id="44" name="Picture"/>
+                    <pic:cNvPr descr="figures/benchmark/fig4_selection_comparison.png" id="45" name="Picture"/>
                     <pic:cNvPicPr>
                       <a:picLocks noChangeArrowheads="1" noChangeAspect="1"/>
                     </pic:cNvPicPr>
                   </pic:nvPicPr>
                   <pic:blipFill>
-                    <a:blip r:embed="rId42"/>
+                    <a:blip r:embed="rId43"/>
                     <a:stretch>
                       <a:fillRect/>
                     </a:stretch>
@@ -1931,8 +2170,8 @@
         <w:t xml:space="preserve">Figure 5. Per-model effect of training-set selection on BO uplift Top-5 at fixed N = 30. Differences are smaller than in the low-N regime, indicating that K-means is most valuable as a cold-start safeguard rather than as a universal advantage at all label budgets.</w:t>
       </w:r>
     </w:p>
-    <w:bookmarkEnd w:id="45"/>
-    <w:bookmarkStart w:id="49" w:name="X68c5d33a711ca70d4ed305e9d4c4716a56b0850"/>
+    <w:bookmarkEnd w:id="46"/>
+    <w:bookmarkStart w:id="50" w:name="X68c5d33a711ca70d4ed305e9d4c4716a56b0850"/>
     <w:p>
       <w:pPr>
         <w:pStyle w:val="Heading3"/>
@@ -1958,18 +2197,18 @@
           <wp:inline>
             <wp:extent cx="5334000" cy="3446173"/>
             <wp:effectExtent b="0" l="0" r="0" t="0"/>
-            <wp:docPr descr="Model comparison" title="" id="47" name="Picture"/>
+            <wp:docPr descr="Model comparison" title="" id="48" name="Picture"/>
             <a:graphic>
               <a:graphicData uri="http://schemas.openxmlformats.org/drawingml/2006/picture">
                 <pic:pic>
                   <pic:nvPicPr>
-                    <pic:cNvPr descr="figures/benchmark/fig5_model_comparison.png" id="48" name="Picture"/>
+                    <pic:cNvPr descr="figures/benchmark/fig5_model_comparison.png" id="49" name="Picture"/>
                     <pic:cNvPicPr>
                       <a:picLocks noChangeArrowheads="1" noChangeAspect="1"/>
                     </pic:cNvPicPr>
                   </pic:nvPicPr>
                   <pic:blipFill>
-                    <a:blip r:embed="rId46"/>
+                    <a:blip r:embed="rId47"/>
                     <a:stretch>
                       <a:fillRect/>
                     </a:stretch>
@@ -3135,8 +3374,8 @@
         <w:t xml:space="preserve">This produces a deliberate score-specific recommendation rather than a single universal winner. RF is retained as the conservative default for pLDDT-driven AF2 triage. Ridge is retained as a production option when the operator wants stronger SoluProt ranking or Top-K recall. XGBoost and LightGBM remain useful alternatives for model-replacement experiments, but the 23-target benchmark no longer supports making LightGBM the default pLDDT surrogate.</w:t>
       </w:r>
     </w:p>
-    <w:bookmarkEnd w:id="49"/>
-    <w:bookmarkStart w:id="50" w:name="X823206a7e1f5910e72abe701b20677c02e34684"/>
+    <w:bookmarkEnd w:id="50"/>
+    <w:bookmarkStart w:id="51" w:name="X823206a7e1f5910e72abe701b20677c02e34684"/>
     <w:p>
       <w:pPr>
         <w:pStyle w:val="Heading3"/>
@@ -3606,8 +3845,8 @@
         <w:t xml:space="preserve">The ensemble result is intentionally conservative. Rank-averaging slightly improves the mean pLDDT selection score, but it does not solve the diversity-loss pattern discussed in Section 3.6 and does not replace Ridge for SoluProt. The recommended deployment therefore stays target-aware: RF for pLDDT-driven AF2 triage, Ridge for SoluProt- or recall-heavy use cases, and the rank-mean ensemble when robustness to per-target ranking flips matters more than the simplicity of one default model.</w:t>
       </w:r>
     </w:p>
-    <w:bookmarkEnd w:id="50"/>
-    <w:bookmarkStart w:id="54" w:name="X1c293ac74cad8042cce27c38937e2a6c22ef074"/>
+    <w:bookmarkEnd w:id="51"/>
+    <w:bookmarkStart w:id="55" w:name="X1c293ac74cad8042cce27c38937e2a6c22ef074"/>
     <w:p>
       <w:pPr>
         <w:pStyle w:val="Heading3"/>
@@ -3633,18 +3872,18 @@
           <wp:inline>
             <wp:extent cx="5334000" cy="3443947"/>
             <wp:effectExtent b="0" l="0" r="0" t="0"/>
-            <wp:docPr descr="Sample size" title="" id="52" name="Picture"/>
+            <wp:docPr descr="Sample size" title="" id="53" name="Picture"/>
             <a:graphic>
               <a:graphicData uri="http://schemas.openxmlformats.org/drawingml/2006/picture">
                 <pic:pic>
                   <pic:nvPicPr>
-                    <pic:cNvPr descr="figures/benchmark/fig8_sample_size.png" id="53" name="Picture"/>
+                    <pic:cNvPr descr="figures/benchmark/fig8_sample_size.png" id="54" name="Picture"/>
                     <pic:cNvPicPr>
                       <a:picLocks noChangeArrowheads="1" noChangeAspect="1"/>
                     </pic:cNvPicPr>
                   </pic:nvPicPr>
                   <pic:blipFill>
-                    <a:blip r:embed="rId51"/>
+                    <a:blip r:embed="rId52"/>
                     <a:stretch>
                       <a:fillRect/>
                     </a:stretch>
@@ -4175,8 +4414,8 @@
         <w:t xml:space="preserve">Table 6. Sample-size ablation for the RF surrogate under K-means selection. The N-ablation captures the diminishing-returns regime above N = 20-30. The N = 30 default is therefore a deliberately conservative cost-efficient operating point, leaving a small margin above N = 20 while avoiding the additional AF2 cost of N = 50-80.</w:t>
       </w:r>
     </w:p>
-    <w:bookmarkEnd w:id="54"/>
-    <w:bookmarkStart w:id="61" w:name="Xddaa9041bd93d1dec5d7071f5ce04061f047afe"/>
+    <w:bookmarkEnd w:id="55"/>
+    <w:bookmarkStart w:id="62" w:name="Xddaa9041bd93d1dec5d7071f5ce04061f047afe"/>
     <w:p>
       <w:pPr>
         <w:pStyle w:val="Heading3"/>
@@ -4202,18 +4441,18 @@
           <wp:inline>
             <wp:extent cx="5334000" cy="4045748"/>
             <wp:effectExtent b="0" l="0" r="0" t="0"/>
-            <wp:docPr descr="Bias analysis" title="" id="56" name="Picture"/>
+            <wp:docPr descr="Bias analysis" title="" id="57" name="Picture"/>
             <a:graphic>
               <a:graphicData uri="http://schemas.openxmlformats.org/drawingml/2006/picture">
                 <pic:pic>
                   <pic:nvPicPr>
-                    <pic:cNvPr descr="figures/benchmark/fig6_bias_analysis.png" id="57" name="Picture"/>
+                    <pic:cNvPr descr="figures/benchmark/fig6_bias_analysis.png" id="58" name="Picture"/>
                     <pic:cNvPicPr>
                       <a:picLocks noChangeArrowheads="1" noChangeAspect="1"/>
                     </pic:cNvPicPr>
                   </pic:nvPicPr>
                   <pic:blipFill>
-                    <a:blip r:embed="rId55"/>
+                    <a:blip r:embed="rId56"/>
                     <a:stretch>
                       <a:fillRect/>
                     </a:stretch>
@@ -4753,18 +4992,18 @@
           <wp:inline>
             <wp:extent cx="5334000" cy="1996939"/>
             <wp:effectExtent b="0" l="0" r="0" t="0"/>
-            <wp:docPr descr="Per-target heatmap" title="" id="59" name="Picture"/>
+            <wp:docPr descr="Per-target heatmap" title="" id="60" name="Picture"/>
             <a:graphic>
               <a:graphicData uri="http://schemas.openxmlformats.org/drawingml/2006/picture">
                 <pic:pic>
                   <pic:nvPicPr>
-                    <pic:cNvPr descr="figures/benchmark/fig7_per_target_heatmap.png" id="60" name="Picture"/>
+                    <pic:cNvPr descr="figures/benchmark/fig7_per_target_heatmap.png" id="61" name="Picture"/>
                     <pic:cNvPicPr>
                       <a:picLocks noChangeArrowheads="1" noChangeAspect="1"/>
                     </pic:cNvPicPr>
                   </pic:nvPicPr>
                   <pic:blipFill>
-                    <a:blip r:embed="rId58"/>
+                    <a:blip r:embed="rId59"/>
                     <a:stretch>
                       <a:fillRect/>
                     </a:stretch>
@@ -4811,8 +5050,8 @@
         <w:t xml:space="preserve">Figure 9. Per-target BO uplift Top-5 difference relative to RF, K-means selection, N = 30. Each cell shows mean(model BO uplift) - mean(RF BO uplift) for one (target, model) pair, averaged over 5 seeds. Positive values mean the model beats RF on that target; negative values mean the model loses. The heatmap exposes target-level winner switching that aggregate means hide, supporting a configurable surrogate layer rather than a hard-coded single model.</w:t>
       </w:r>
     </w:p>
-    <w:bookmarkEnd w:id="61"/>
-    <w:bookmarkStart w:id="65" w:name="Xf711a228bc721b3d7918124db93d7c18a63f50a"/>
+    <w:bookmarkEnd w:id="62"/>
+    <w:bookmarkStart w:id="66" w:name="Xf711a228bc721b3d7918124db93d7c18a63f50a"/>
     <w:p>
       <w:pPr>
         <w:pStyle w:val="Heading3"/>
@@ -4838,18 +5077,18 @@
           <wp:inline>
             <wp:extent cx="5334000" cy="3740385"/>
             <wp:effectExtent b="0" l="0" r="0" t="0"/>
-            <wp:docPr descr="MPNN error decomposition" title="" id="63" name="Picture"/>
+            <wp:docPr descr="MPNN error decomposition" title="" id="64" name="Picture"/>
             <a:graphic>
               <a:graphicData uri="http://schemas.openxmlformats.org/drawingml/2006/picture">
                 <pic:pic>
                   <pic:nvPicPr>
-                    <pic:cNvPr descr="figures/benchmark/fig10_mpnn_decomposition.png" id="64" name="Picture"/>
+                    <pic:cNvPr descr="figures/benchmark/fig10_mpnn_decomposition.png" id="65" name="Picture"/>
                     <pic:cNvPicPr>
                       <a:picLocks noChangeArrowheads="1" noChangeAspect="1"/>
                     </pic:cNvPicPr>
                   </pic:nvPicPr>
                   <pic:blipFill>
-                    <a:blip r:embed="rId62"/>
+                    <a:blip r:embed="rId63"/>
                     <a:stretch>
                       <a:fillRect/>
                     </a:stretch>
@@ -5091,8 +5330,8 @@
         <w:t xml:space="preserve">This result does not prove that ProteinMPNN is globally optimal. A low within-target variance is also consistent with a model that makes the same systematic mistake repeatedly. The result instead identifies where additional sampling is least likely to help in this dataset: drawing more sequences from the same target has limited observed headroom compared with changing or triaging the target/backbone context.</w:t>
       </w:r>
     </w:p>
-    <w:bookmarkEnd w:id="65"/>
-    <w:bookmarkStart w:id="66" w:name="Xf571f53620ed178c418340a9b0d45d6a7714fe2"/>
+    <w:bookmarkEnd w:id="66"/>
+    <w:bookmarkStart w:id="67" w:name="Xf571f53620ed178c418340a9b0d45d6a7714fe2"/>
     <w:p>
       <w:pPr>
         <w:pStyle w:val="Heading3"/>
@@ -5556,8 +5795,8 @@
         <w:t xml:space="preserve">The two evolution traces also show why the multi-round result should be interpreted cautiously. In 3RGK, the best composite design was already present in the round-1 bootstrap training set, so later surrogate-guided rounds did not improve the selected best design even though they continued to find high-pLDDT candidates. In 1LVM, the best design was selected during the round-3 Top-K phase, demonstrating that archived surrogate reuse can identify later-round candidates. This supports the implementation claim, but a larger paired campaign is still needed to estimate hit-rate improvement.</w:t>
       </w:r>
     </w:p>
-    <w:bookmarkEnd w:id="66"/>
-    <w:bookmarkStart w:id="70" w:name="X44c7bd05f3d5ced2126af2bc7a7899acac604f6"/>
+    <w:bookmarkEnd w:id="67"/>
+    <w:bookmarkStart w:id="71" w:name="X44c7bd05f3d5ced2126af2bc7a7899acac604f6"/>
     <w:p>
       <w:pPr>
         <w:pStyle w:val="Heading3"/>
@@ -5591,18 +5830,18 @@
           <wp:inline>
             <wp:extent cx="5334000" cy="1668473"/>
             <wp:effectExtent b="0" l="0" r="0" t="0"/>
-            <wp:docPr descr="Backbone and ensemble ablation" title="" id="68" name="Picture"/>
+            <wp:docPr descr="Backbone and ensemble ablation" title="" id="69" name="Picture"/>
             <a:graphic>
               <a:graphicData uri="http://schemas.openxmlformats.org/drawingml/2006/picture">
                 <pic:pic>
                   <pic:nvPicPr>
-                    <pic:cNvPr descr="figures/benchmark/fig12_backbone_ensemble_ablation.png" id="69" name="Picture"/>
+                    <pic:cNvPr descr="figures/benchmark/fig12_backbone_ensemble_ablation.png" id="70" name="Picture"/>
                     <pic:cNvPicPr>
                       <a:picLocks noChangeArrowheads="1" noChangeAspect="1"/>
                     </pic:cNvPicPr>
                   </pic:nvPicPr>
                   <pic:blipFill>
-                    <a:blip r:embed="rId67"/>
+                    <a:blip r:embed="rId68"/>
                     <a:stretch>
                       <a:fillRect/>
                     </a:stretch>
@@ -5927,9 +6166,9 @@
         <w:t xml:space="preserve">Table 10. Backbone-context ablation summary. Values are target-level means over three CATH targets and one replicate per target. The selected-RFD3 arm gives the highest mean Top-5 pLDDT, while the ensemble arm gives the highest mean Top-5 SoluProt and broader sequence diversity. Because the pilot contains three paired targets, it is used to guide interpretation and workflow defaults rather than to claim a general statistical advantage.</w:t>
       </w:r>
     </w:p>
-    <w:bookmarkEnd w:id="70"/>
     <w:bookmarkEnd w:id="71"/>
-    <w:bookmarkStart w:id="76" w:name="discussion"/>
+    <w:bookmarkEnd w:id="72"/>
+    <w:bookmarkStart w:id="77" w:name="discussion"/>
     <w:p>
       <w:pPr>
         <w:pStyle w:val="Heading2"/>
@@ -5938,7 +6177,7 @@
         <w:t xml:space="preserve">4. Discussion</w:t>
       </w:r>
     </w:p>
-    <w:bookmarkStart w:id="72" w:name="X28ae9d35d69a29e7e3814ac014f0d9cd05b1635"/>
+    <w:bookmarkStart w:id="73" w:name="X28ae9d35d69a29e7e3814ac014f0d9cd05b1635"/>
     <w:p>
       <w:pPr>
         <w:pStyle w:val="Heading3"/>
@@ -6349,8 +6588,8 @@
         <w:t xml:space="preserve">on the operations performed in Results. The artifact contract is what allows the same 2,737 AF2 outputs to support multiple independent ablations without re-folding or per-experiment parser rewrites.</w:t>
       </w:r>
     </w:p>
-    <w:bookmarkEnd w:id="72"/>
-    <w:bookmarkStart w:id="73" w:name="af2-budget-model"/>
+    <w:bookmarkEnd w:id="73"/>
+    <w:bookmarkStart w:id="74" w:name="af2-budget-model"/>
     <w:p>
       <w:pPr>
         <w:pStyle w:val="Heading3"/>
@@ -6604,8 +6843,8 @@
         <w:t xml:space="preserve">The representative 3RGK and 1LVM evolution runs in Section 3.8 use larger RFD3-enabled pools than the 90-candidate budget illustration, with 8,000 SoluProt-gated candidates per target. Their realized AF2 records were 94 and 49, respectively, because only the bootstrap and surrogate-selected candidates are sent to the oracle. These runs validate the implemented execution path and artifact capture; a larger paired campaign remains necessary to estimate biological hit-rate improvement from archived surrogate reuse.</w:t>
       </w:r>
     </w:p>
-    <w:bookmarkEnd w:id="73"/>
-    <w:bookmarkStart w:id="74" w:name="compute-allocation-across-backbones"/>
+    <w:bookmarkEnd w:id="74"/>
+    <w:bookmarkStart w:id="75" w:name="compute-allocation-across-backbones"/>
     <w:p>
       <w:pPr>
         <w:pStyle w:val="Heading3"/>
@@ -6630,8 +6869,8 @@
         <w:t xml:space="preserve">The three-target pilot in Section 3.9 is consistent with this interpretation. RFD3 changed the structural context and sometimes improved pLDDT, but the effect depended on the target and did not establish a universal ordering among single-backbone, RFD3, and RFD3-ensemble modes. Within a chosen backbone, conservation-tier sampling remains useful because it changes the number and placement of jointly redesigned positions, but the observed within-target spread bounds its expected return. Acquisition-time diversity control is still needed because the surrogate’s selected Top-K is more self-similar than the true optimum. These conclusions are complementary: backbone or target triage addresses the largest observed variance axis, while acquisition diversity prevents local surrogate selections from collapsing within a promising context.</w:t>
       </w:r>
     </w:p>
-    <w:bookmarkEnd w:id="74"/>
-    <w:bookmarkStart w:id="75" w:name="re-validation-after-model-replacement"/>
+    <w:bookmarkEnd w:id="75"/>
+    <w:bookmarkStart w:id="76" w:name="re-validation-after-model-replacement"/>
     <w:p>
       <w:pPr>
         <w:pStyle w:val="Heading3"/>
@@ -6648,9 +6887,9 @@
         <w:t xml:space="preserve">The benchmark results should be interpreted as estimates for the current solubility-aware model stack, not as invariant statements about all future structure predictors, inverse-folding models, or solubility predictors. The pipeline design makes this limitation manageable. If a replacement structure predictor such as ESMFold or AlphaFold3, a replacement inverse-folding model such as LigandMPNN or SolubleMPNN, or a replacement solubility/developability model writes the same artifact fields, the same benchmark protocol can be rerun. The numerical operating point may change, but the analysis workflow does not need to be redesigned.</w:t>
       </w:r>
     </w:p>
-    <w:bookmarkEnd w:id="75"/>
     <w:bookmarkEnd w:id="76"/>
-    <w:bookmarkStart w:id="77" w:name="limitations"/>
+    <w:bookmarkEnd w:id="77"/>
+    <w:bookmarkStart w:id="78" w:name="limitations"/>
     <w:p>
       <w:pPr>
         <w:pStyle w:val="Heading2"/>
@@ -6810,7 +7049,7 @@
         <w:t xml:space="preserve"> </w:t>
       </w:r>
       <w:r>
-        <w:t xml:space="preserve">Literature-grounded commentary and Gemini-based reasoning are operational components of the platform, but the reported benchmark does not validate autonomous agent selection of mutation masks. The learning component evaluated here is the ESM-embedding surrogate trained on AF2/ColabFold labels.</w:t>
+        <w:t xml:space="preserve">The evidence-agent layer is evaluated here as structured decision support and auditability infrastructure, not as an autonomous mutation-policy model. The reported benchmark does not validate agent selection of mutation masks; the learning component evaluated here is the ESM-embedding surrogate trained on AF2/ColabFold labels.</w:t>
       </w:r>
     </w:p>
     <w:p>
@@ -6835,8 +7074,8 @@
         <w:t xml:space="preserve">The architecture supports model replacement by artifact contract, but the benchmark has not yet been rerun with AlphaFold3, ESMFold, LigandMPNN, or another replacement backend.</w:t>
       </w:r>
     </w:p>
-    <w:bookmarkEnd w:id="77"/>
-    <w:bookmarkStart w:id="78" w:name="conclusion"/>
+    <w:bookmarkEnd w:id="78"/>
+    <w:bookmarkStart w:id="79" w:name="conclusion"/>
     <w:p>
       <w:pPr>
         <w:pStyle w:val="Heading2"/>
@@ -6870,8 +7109,8 @@
         <w:t xml:space="preserve">The empirical benchmark shows that K-means selection improves small-N surrogate performance, that surrogate choice is score-dependent, and that a 20-30 example training set is a cost-efficient operating point. The variance decomposition further shows that target identity, not ProteinMPNN sampling noise, dominates observed pLDDT variance in the 23-target benchmark set. These results support a compute policy in which SoluProt is used as the fast soluble-expression gate, AF2 is reserved for informative structurally plausible short lists, and early campaign budget is allocated across target or backbone contexts rather than only to deeper sequence sampling within one backbone. The pipeline’s artifact contract makes these conclusions re-testable as the underlying generative, solubility-prediction, and structure-prediction models change.</w:t>
       </w:r>
     </w:p>
-    <w:bookmarkEnd w:id="78"/>
-    <w:bookmarkStart w:id="79" w:name="code-data-and-software-availability"/>
+    <w:bookmarkEnd w:id="79"/>
+    <w:bookmarkStart w:id="80" w:name="code-data-and-software-availability"/>
     <w:p>
       <w:pPr>
         <w:pStyle w:val="Heading2"/>
@@ -6981,7 +7220,7 @@
         <w:t xml:space="preserve">cath_outputs/paper_curated/</w:t>
       </w:r>
       <w:r>
-        <w:t xml:space="preserve">. Because the full corpus is several gigabytes, it should be archived as a large release artifact or S3-backed dataset rather than committed directly to a lightweight GitHub source tree. The release documentation also records the Docker Hub images used to instantiate the RunPod endpoints for MMseqs2, ProteinMPNN, ColabFold/AF2, RFD3, BioEmu, and Rosetta Relax. The included</w:t>
+        <w:t xml:space="preserve">. Because the full corpus is several gigabytes, it should be archived as a large release artifact or S3-backed dataset rather than committed directly to a lightweight GitHub source tree. The release documentation also records the Docker Hub images used to instantiate the RunPod endpoints for MMseqs2, ProteinMPNN, ColabFold/AF2, RFD3, BioEmu, and Rosetta Relax. Runtime runs additionally emit</w:t>
       </w:r>
       <w:r>
         <w:t xml:space="preserve"> </w:t>
@@ -6990,6 +7229,57 @@
         <w:rPr>
           <w:rStyle w:val="VerbatimChar"/>
         </w:rPr>
+        <w:t xml:space="preserve">orchestration_trace.jsonl</w:t>
+      </w:r>
+      <w:r>
+        <w:t xml:space="preserve">,</w:t>
+      </w:r>
+      <w:r>
+        <w:t xml:space="preserve"> </w:t>
+      </w:r>
+      <w:r>
+        <w:rPr>
+          <w:rStyle w:val="VerbatimChar"/>
+        </w:rPr>
+        <w:t xml:space="preserve">events.jsonl</w:t>
+      </w:r>
+      <w:r>
+        <w:t xml:space="preserve">, and</w:t>
+      </w:r>
+      <w:r>
+        <w:t xml:space="preserve"> </w:t>
+      </w:r>
+      <w:r>
+        <w:rPr>
+          <w:rStyle w:val="VerbatimChar"/>
+        </w:rPr>
+        <w:t xml:space="preserve">agent_panel.jsonl</w:t>
+      </w:r>
+      <w:r>
+        <w:t xml:space="preserve"> </w:t>
+      </w:r>
+      <w:r>
+        <w:t xml:space="preserve">under each</w:t>
+      </w:r>
+      <w:r>
+        <w:t xml:space="preserve"> </w:t>
+      </w:r>
+      <w:r>
+        <w:rPr>
+          <w:rStyle w:val="VerbatimChar"/>
+        </w:rPr>
+        <w:t xml:space="preserve">run_id</w:t>
+      </w:r>
+      <w:r>
+        <w:t xml:space="preserve">, allowing control-plane execution and evidence-agent verdicts to be audited separately. The included</w:t>
+      </w:r>
+      <w:r>
+        <w:t xml:space="preserve"> </w:t>
+      </w:r>
+      <w:r>
+        <w:rPr>
+          <w:rStyle w:val="VerbatimChar"/>
+        </w:rPr>
         <w:t xml:space="preserve">.env.example</w:t>
       </w:r>
       <w:r>
@@ -7014,8 +7304,8 @@
         <w:t xml:space="preserve">files, endpoint IDs, API keys, and runtime logs are excluded. The manuscript uses stored benchmark artifacts rather than modifying generated result values. For publication, the GitHub release should be archived with a persistent DOI, and the same archive should contain the benchmark data used to regenerate the reported tables and figures.</w:t>
       </w:r>
     </w:p>
-    <w:bookmarkEnd w:id="79"/>
-    <w:bookmarkStart w:id="80" w:name="references"/>
+    <w:bookmarkEnd w:id="80"/>
+    <w:bookmarkStart w:id="81" w:name="references"/>
     <w:p>
       <w:pPr>
         <w:pStyle w:val="Heading2"/>
@@ -7549,8 +7839,8 @@
         <w:t xml:space="preserve">. doi:10.1037/0033-2909.86.2.420</w:t>
       </w:r>
     </w:p>
-    <w:bookmarkEnd w:id="80"/>
     <w:bookmarkEnd w:id="81"/>
+    <w:bookmarkEnd w:id="82"/>
     <w:sectPr/>
   </w:body>
 </w:document>

</xml_diff>